<commit_message>
Automate publications numbering starting with newest as 1 and update manual
</commit_message>
<xml_diff>
--- a/Website_Content_Update_Manual_final.docx
+++ b/Website_Content_Update_Manual_final.docx
@@ -1290,7 +1290,7 @@
           <w:color w:val="333333"/>
           <w:sz w:val="22"/>
         </w:rPr>
-        <w:t>Publications are grouped by year in const publications = [ (Line 516).</w:t>
+        <w:t>Publications are grouped by year in const publications = [ (Line 516). The numbering is fully automated by the website code, with the newest publication dynamically labeled as 1. You do not need to add numbers to the citation strings.</w:t>
       </w:r>
     </w:p>
     <w:p>
@@ -1338,7 +1338,7 @@
                 <w:color w:val="7C3AED"/>
                 <w:sz w:val="19"/>
               </w:rPr>
-              <w:t>"1. Authors. Paper title. Journal name. Year. DOI Link",</w:t>
+              <w:t>"Authors. Paper title. Journal name. Year. DOI Link",</w:t>
             </w:r>
           </w:p>
         </w:tc>

</xml_diff>